<commit_message>
Add BDD, performance testing, and container skills
Cucumber/BDD, Apache JMeter, and Docker/Kubernetes added to the resume,
with the PDF font trimmed slightly to hold at 2 pages.

Co-Authored-By: Claude Sonnet 5 <noreply@anthropic.com>
</commit_message>
<xml_diff>
--- a/resume.docx
+++ b/resume.docx
@@ -455,7 +455,7 @@
                 <w:color w:val="5A5A5A"/>
                 <w:sz w:val="19"/>
               </w:rPr>
-              <w:t>AWS, Azure</w:t>
+              <w:t>AWS, Azure, Docker, Kubernetes</w:t>
             </w:r>
           </w:p>
         </w:tc>
@@ -543,7 +543,7 @@
                 <w:color w:val="5A5A5A"/>
                 <w:sz w:val="19"/>
               </w:rPr>
-              <w:t>Selenium, Robot Framework, Karate Framework, UI Testing, API Testing</w:t>
+              <w:t>Selenium, Robot Framework, Karate Framework, Cucumber (BDD), Apache JMeter, UI Testing, API Testing</w:t>
             </w:r>
           </w:p>
         </w:tc>
@@ -791,7 +791,20 @@
         <w:rPr>
           <w:sz w:val="21"/>
         </w:rPr>
-        <w:t>Explored and integrated Generative AI capabilities to enhance automation, testing efficiency, and program management, developing internal applications and Proof-of-Concepts (POCs) for productivity tools using Streamlit, FastAPI, and Milvus.</w:t>
+        <w:t>Designed and implemented a BDD test automation framework using Cucumber, authoring feature files and step definitions to translate business requirements into automated, business-readable test coverage.</w:t>
+      </w:r>
+    </w:p>
+    <w:p>
+      <w:pPr>
+        <w:pStyle w:val="ListBullet"/>
+        <w:spacing w:after="80"/>
+        <w:ind w:left="288" w:hanging="288"/>
+      </w:pPr>
+      <w:r>
+        <w:rPr>
+          <w:sz w:val="21"/>
+        </w:rPr>
+        <w:t>Explored and integrated Generative AI capabilities to enhance automation, testing efficiency, and program management, developing internal applications and Proof-of-Concepts (POCs) for productivity tools using Streamlit, FastAPI, and Milvus, with hands-on exposure to Docker and Kubernetes for containerized deployment of these tools.</w:t>
       </w:r>
     </w:p>
     <w:p>
@@ -881,6 +894,19 @@
           <w:sz w:val="21"/>
         </w:rPr>
         <w:t>Practiced TDD methodologies, CI/CD framework, and Agile/DevOps methodologies, utilizing automation tools like Selenium, Robot Framework, and Karate Framework.</w:t>
+      </w:r>
+    </w:p>
+    <w:p>
+      <w:pPr>
+        <w:pStyle w:val="ListBullet"/>
+        <w:spacing w:after="80"/>
+        <w:ind w:left="288" w:hanging="288"/>
+      </w:pPr>
+      <w:r>
+        <w:rPr>
+          <w:sz w:val="21"/>
+        </w:rPr>
+        <w:t>Conducted performance testing using Apache JMeter and custom Python scripts to validate system behavior under load.</w:t>
       </w:r>
     </w:p>
     <w:p>

</xml_diff>